<commit_message>
adaptshrink-nma manuscript: add section 4.5 sparsity robustness (topology + studies-per-edge)
Folds this session's topology + m-sweep results into the manuscript, directly addressing the standing
'single geometry and density' limitation. New section 4.5: win robust across dense/ladder/star (largest
on sparse ladder) and studies-per-edge down to m=1 under strong selection; topology-dependent threshold;
honest fresh-harness (relative, not grid-identical) framing. Limitation bullet updated to 'partially
addressed in 4.5'. docx rebuilt+validated (section present, no leaks).

Co-Authored-By: Claude Opus 4.8 (1M context) <noreply@anthropic.com>
</commit_message>
<xml_diff>
--- a/manuscript/AdaptShrink_NMA.docx
+++ b/manuscript/AdaptShrink_NMA.docx
@@ -816,6 +816,22 @@
     </w:p>
     <w:p>
       <w:pPr>
+        <w:pStyle w:val="Heading2"/>
+      </w:pPr>
+      <w:r>
+        <w:t xml:space="preserve">4.5 Robustness across network sparsity (topology and studies-per-edge)</w:t>
+      </w:r>
+    </w:p>
+    <w:p>
+      <w:pPr>
+        <w:spacing w:after="120" w:line="276"/>
+      </w:pPr>
+      <w:r>
+        <w:t xml:space="preserve">The 60-cell grid holds geometry fixed at dense full networks with 8–15 studies per edge. Because real networks are usually sparser, we probed the two held-fixed sparsity dimensions with a separate, internally-consistent harness (nma/topology_stress.py, topology_sweep.py, msweep.py; n = 8, strong pre-declared small-study effect, adaptshrink_nma_auto vs common-DL, matched-coverage MCIW0 + paired bootstrap) — a complementary relative comparison that deliberately does not reproduce the grid's absolute numbers. Topology: under strong selection the win is robust in all three topologies — dense (ΔMCIW0 −0.334), sparse ladder/chain (−0.385, the largest gain, as a chain has no triangulating indirect evidence so common-DL is most unstable), and star (−0.118). A B × topology region map refines this: the win threshold is topology-dependent — dense wins from moderate selection (B ≥ 0.5), sparse ladder/star need strong selection (B = 1.0) — with a small over-correction cost at zero selection (largest on the ladder), consistent with the grid's no-selection control. Studies-per-edge: sweeping m = 1…8 (dense, strong selection) the win holds at every count including the hardest realistic case of a single study per direct comparison (m = 1: ΔMCIW0 −0.282 [−0.320, −0.253]). So under sufficient selection the win is robust across all three orthogonal sparsity axes — network size, topology, and studies-per-edge — the regime real evidence networks occupy. (nma/REPORT_NMA_TOPOLOGY.md.)</w:t>
+      </w:r>
+    </w:p>
+    <w:p>
+      <w:pPr>
         <w:pStyle w:val="Heading1"/>
       </w:pPr>
       <w:r>
@@ -1028,10 +1044,10 @@
           <w:b/>
           <w:bCs/>
         </w:rPr>
-        <w:t xml:space="preserve">Single geometry and density. </w:t>
-      </w:r>
-      <w:r>
-        <w:t xml:space="preserve">The whole grid is dense full networks (8–15 studies/edge). Sparser or non-full geometries are out of scope here.</w:t>
+        <w:t xml:space="preserve">Single geometry and density (grid); partially addressed in §4.5. </w:t>
+      </w:r>
+      <w:r>
+        <w:t xml:space="preserve">The 60-cell grid itself is dense full networks (8–15 studies/edge). A separate complementary harness (§4.5) shows the win survives sparse star/ladder topologies and studies-per-edge down to m = 1 under strong selection — with a topology-dependent threshold and a fresh-harness (relative) rather than grid-identical protocol; a unified sparse-grid run remains future work.</w:t>
       </w:r>
     </w:p>
     <w:p>

</xml_diff>